<commit_message>
Translate Annex 30 and update Annex 22, 23 Org translations
- Annex 30: Admission Regulations to Bachelor (27 pages) - new
- Annex 22, 23 Org: minor translation updates

Co-Authored-By: Claude Opus 4.6 <noreply@anthropic.com>
Claude-Session: https://claude.ai/code/session_01N9ZP28hxEfPoWHf2qaE8QM
</commit_message>
<xml_diff>
--- a/Computer Engineering, Software Engineering, Computer systems & their softwares/Annexes/Annex №22 NQF COMPUTER SYSTEMS AND THEIR SOFTWARES.docx
+++ b/Computer Engineering, Software Engineering, Computer systems & their softwares/Annexes/Annex №22 NQF COMPUTER SYSTEMS AND THEIR SOFTWARES.docx
@@ -131,7 +131,7 @@
           <w:color w:val="000000"/>
           <w:sz w:val="40"/>
         </w:rPr>
-        <w:t xml:space="preserve">THE MASTER’S SPECIALTY </w:t>
+        <w:t xml:space="preserve">MAGISTRLIK MUTAXASSISLIGI </w:t>
       </w:r>
       <w:r>
         <w:br/>
@@ -294,11 +294,12 @@
         <w:jc w:val="left"/>
       </w:pPr>
       <w:r>
+        <w:t xml:space="preserve">TASDIQLANGAN VA AMALGA KIRITILGAN: </w:t>
+        <w:br/>
         <w:tab/>
-      </w:r>
-      <w:r>
-        <w:tab/>
-      </w:r>
+        <w:t>O'zbekiston Respublikasi Oliy ta'lim, fan va innovatsiyalar vazirligining "___" _________, 2024-yildagi ____ - sonli buyrug'i bilan.</w:t>
+      </w:r>
+      <w:r/>
       <w:r>
         <w:rPr>
           <w:rFonts w:ascii="Arial" w:hAnsi="Arial" w:eastAsia="Arial"/>
@@ -307,14 +308,9 @@
           <w:color w:val="000000"/>
           <w:sz w:val="32"/>
         </w:rPr>
-        <w:t xml:space="preserve">TASDIQLANGAN VA AMALGA KIRITILGAN: </w:t>
-      </w:r>
-      <w:r>
-        <w:br/>
-      </w:r>
-      <w:r>
-        <w:tab/>
-      </w:r>
+      </w:r>
+      <w:r/>
+      <w:r/>
       <w:r>
         <w:rPr>
           <w:rFonts w:ascii="Arial" w:hAnsi="Arial" w:eastAsia="Arial"/>
@@ -323,7 +319,6 @@
           <w:color w:val="000000"/>
           <w:sz w:val="32"/>
         </w:rPr>
-        <w:t xml:space="preserve">O'zbekiston Respublikasi Oliy ta'lim, fan va </w:t>
       </w:r>
       <w:r>
         <w:rPr>
@@ -333,17 +328,10 @@
           <w:color w:val="000000"/>
           <w:sz w:val="32"/>
         </w:rPr>
-        <w:t xml:space="preserve">Innovations of the Republic of Uzbekistan No. ____ dated “___” </w:t>
-      </w:r>
-      <w:r>
-        <w:tab/>
-      </w:r>
-      <w:r>
-        <w:tab/>
-      </w:r>
-      <w:r>
-        <w:tab/>
-      </w:r>
+      </w:r>
+      <w:r/>
+      <w:r/>
+      <w:r/>
       <w:r>
         <w:rPr>
           <w:rFonts w:ascii="Arial" w:hAnsi="Arial" w:eastAsia="Arial"/>
@@ -352,7 +340,6 @@
           <w:color w:val="000000"/>
           <w:sz w:val="32"/>
         </w:rPr>
-        <w:t>_________, 2024-yildagi ____ - sonli buyrug'i bilan.</w:t>
       </w:r>
     </w:p>
     <w:p>
@@ -485,7 +472,7 @@
           <w:color w:val="000000"/>
           <w:sz w:val="28"/>
         </w:rPr>
-        <w:t xml:space="preserve">The right to officially publish Qualification Requirements in the territory of the </w:t>
+        <w:t>O'zbekiston Respublikasi hududida Malaka talablarini rasmiy nashr etish huquqi O'zbekiston Respublikasi Oliy ta'lim, fan va innovatsiyalar vazirligiga tegishlidir.</w:t>
       </w:r>
       <w:r>
         <w:rPr>
@@ -495,7 +482,6 @@
           <w:color w:val="000000"/>
           <w:sz w:val="28"/>
         </w:rPr>
-        <w:t xml:space="preserve">huquqi O'zbekiston Respublikasi Oliy ta'lim, fan va </w:t>
       </w:r>
       <w:r>
         <w:rPr>
@@ -505,7 +491,6 @@
           <w:color w:val="000000"/>
           <w:sz w:val="28"/>
         </w:rPr>
-        <w:t xml:space="preserve">innovatsiyalar vazirligiga tegishlidir. </w:t>
       </w:r>
     </w:p>
     <w:p>
@@ -1021,10 +1006,10 @@
           <w:sz w:val="28"/>
         </w:rPr>
         <w:t xml:space="preserve">1. UMUMIY TAVSIF </w:t>
-      </w:r>
-      <w:r>
         <w:br/>
-      </w:r>
+        <w:t>Magistratura talabalarini 70610101 - Kompyuter tizimlari va ularning dasturiy ta'minoti mutaxassisligi bo'yicha tayyorlash kunduzgi ta'lim shaklida amalga oshiriladi. Barcha ta'lim shakllarida o'qitish kredit-modul tizimi asosida tashkil etiladi. Magistratura dasturining standart davomiyligi ikki yilni tashkil etadi.</w:t>
+      </w:r>
+      <w:r/>
       <w:r>
         <w:rPr>
           <w:rFonts w:ascii="Arial" w:hAnsi="Arial" w:eastAsia="Arial"/>
@@ -1033,7 +1018,6 @@
           <w:color w:val="000000"/>
           <w:sz w:val="28"/>
         </w:rPr>
-        <w:t xml:space="preserve">Training of master’s degree students in the specialty </w:t>
       </w:r>
       <w:r>
         <w:rPr>
@@ -1043,7 +1027,6 @@
           <w:color w:val="000000"/>
           <w:sz w:val="28"/>
         </w:rPr>
-        <w:t xml:space="preserve">70610101 - Kompyuter tizimlari va ularning </w:t>
       </w:r>
       <w:r>
         <w:rPr>
@@ -1053,7 +1036,6 @@
           <w:color w:val="000000"/>
           <w:sz w:val="28"/>
         </w:rPr>
-        <w:t>dasturiy ta'minoti</w:t>
       </w:r>
       <w:r>
         <w:rPr>
@@ -1063,7 +1045,6 @@
           <w:color w:val="000000"/>
           <w:sz w:val="28"/>
         </w:rPr>
-        <w:t xml:space="preserve"> mutaxassisligi bo'yicha tayyorlash kunduzgi ta'lim shaklida amalga oshiriladi. </w:t>
       </w:r>
       <w:r>
         <w:rPr>
@@ -1073,7 +1054,6 @@
           <w:color w:val="000000"/>
           <w:sz w:val="28"/>
         </w:rPr>
-        <w:t xml:space="preserve">Barcha ta'lim shakllarida o'qitish kredit-modul tizimi </w:t>
       </w:r>
       <w:r>
         <w:rPr>
@@ -1083,7 +1063,6 @@
           <w:color w:val="000000"/>
           <w:sz w:val="28"/>
         </w:rPr>
-        <w:t xml:space="preserve">module system. The standard duration of the master’s degree program is two </w:t>
       </w:r>
       <w:r>
         <w:rPr>
@@ -1093,7 +1072,6 @@
           <w:color w:val="000000"/>
           <w:sz w:val="28"/>
         </w:rPr>
-        <w:t xml:space="preserve">yilni tashkil etadi. </w:t>
       </w:r>
     </w:p>
     <w:p>
@@ -1153,7 +1131,7 @@
           <w:color w:val="000000"/>
           <w:sz w:val="28"/>
         </w:rPr>
-        <w:t xml:space="preserve">Ushbu Malaka talablari barcha oliy ta'lim muassasalari uchun </w:t>
+        <w:t>Ushbu Malaka talablari 70610101 - Kompyuter tizimlari va ularning dasturiy ta'minoti mutaxassisligi bo'yicha magistratura talabalarini tayyorlaydigan barcha oliy ta'lim muassasalari uchun talablar majmuasini belgilaydi.</w:t>
       </w:r>
       <w:r>
         <w:rPr>
@@ -1163,7 +1141,6 @@
           <w:color w:val="000000"/>
           <w:sz w:val="28"/>
         </w:rPr>
-        <w:t xml:space="preserve">education institutions that provide training for master’s degree students in the </w:t>
       </w:r>
       <w:r>
         <w:rPr>
@@ -1173,7 +1150,6 @@
           <w:color w:val="000000"/>
           <w:sz w:val="28"/>
         </w:rPr>
-        <w:t xml:space="preserve">mutaxassisligi bo'yicha tayyorlaydigan talablar majmuasini belgilaydi. </w:t>
       </w:r>
       <w:r>
         <w:rPr>
@@ -1183,7 +1159,6 @@
           <w:color w:val="000000"/>
           <w:sz w:val="28"/>
         </w:rPr>
-        <w:t xml:space="preserve">70610101 - Kompyuter tizimlari va ularning dasturiy ta'minoti. </w:t>
       </w:r>
     </w:p>
     <w:p>
@@ -3976,10 +3951,10 @@
           <w:sz w:val="20"/>
         </w:rPr>
         <w:t>-</w:t>
-      </w:r>
-      <w:r>
         <w:tab/>
-      </w:r>
+        <w:t>kompyuter muhandisligi sohasida raqamli texnologiyalar asosida start-up loyihalarni ishlab chiqish, tadbirkorlikni boshlash va boshqarish;</w:t>
+      </w:r>
+      <w:r/>
       <w:r>
         <w:rPr>
           <w:rFonts w:ascii="Arial" w:hAnsi="Arial" w:eastAsia="Arial"/>
@@ -3988,11 +3963,8 @@
           <w:color w:val="000000"/>
           <w:sz w:val="28"/>
         </w:rPr>
-        <w:t xml:space="preserve">develop start-up projects based on digital technologies in the field of </w:t>
-      </w:r>
-      <w:r>
-        <w:tab/>
-      </w:r>
+      </w:r>
+      <w:r/>
       <w:r>
         <w:rPr>
           <w:rFonts w:ascii="Arial" w:hAnsi="Arial" w:eastAsia="Arial"/>
@@ -4001,7 +3973,6 @@
           <w:color w:val="000000"/>
           <w:sz w:val="28"/>
         </w:rPr>
-        <w:t xml:space="preserve">computer engineering, and start and manage businesses; </w:t>
       </w:r>
     </w:p>
     <w:p>
@@ -4410,7 +4381,31 @@
           <w:color w:val="000000"/>
           <w:sz w:val="20"/>
         </w:rPr>
-        <w:t></w:t>
+        <w:t xml:space="preserve">•egallangan bilimlarni ijodiy va tanqidiy ko'rib chiqish va tahlil qilish, ularni ilmiy va ilmiy-texnik ijodiy faoliyatda qo'llash va asosli mustaqil qarorlar qabul qilishga qodir bo'lish; </w:t>
+        <w:br/>
+        <w:t xml:space="preserve">•ilmiy va ilmiy-texnik ijodiy faoliyat natijalarini tushunishga yo'naltirilgan ijtimoiy mas'uliyatni rivojlantirish; </w:t>
+        <w:br/>
+        <w:t xml:space="preserve">•kasbiy faoliyatda o'zlashtirilgan fanlarning asosiy qonuniyatlarini qo'llash, usullarni tasniflash va ilmiy va ilmiy-texnik ijodiy faoliyatda metodologik tamoyillardan foydalanish; </w:t>
+        <w:br/>
+        <w:t xml:space="preserve">•ilmiy muloqot va kasbiy almashish vositasi sifatida bitta chet tilini egallash; </w:t>
+        <w:br/>
+        <w:t xml:space="preserve">•axborotni to'plash, saqlash, qayta ishlash va foydalanish usullarini egallash; </w:t>
+        <w:br/>
+        <w:t xml:space="preserve">•kasbiy faoliyatda asosli mustaqil qarorlar qabul qilishga qodir bo'lish; </w:t>
+        <w:br/>
+        <w:t xml:space="preserve">•axborot, bilim va ma'lumotlarni farqlashga va axborot texnologiyalaridan foydalanishga qodir bo'lish; </w:t>
+        <w:br/>
+        <w:t xml:space="preserve">•bugungi axborot jamiyatida axborot texnologiyalarining mohiyati va ahamiyatini tushunish, axborot hujumlarining xavf va tahdidlarini anglash va axborot xavfsizligining asosiy talablariga rioya qilish; </w:t>
+        <w:br/>
+        <w:t xml:space="preserve">•Internetdan axborot olish, saqlash va qayta ishlashning asosiy usullari va vositalariga ega bo'lish hamda axborotni boshqarish vositasi sifatida kompyuter ko'nikmalariga ega bo'lish; </w:t>
+        <w:br/>
+        <w:t xml:space="preserve">•pedagogik faoliyatda axborot va pedagogik texnologiyalardan samarali foydalanish; </w:t>
+        <w:br/>
+        <w:t xml:space="preserve">•ta'lim va ilmiy-texnik ijodiy faoliyat sifati va samaradorligini oshirishda innovatsion yondashuvni qo'llash; </w:t>
+        <w:br/>
+        <w:t xml:space="preserve">•ilmiy-texnik ijodiy faoliyat natijalari asosida respublikada va xorijda e'lon qilingan loyihalarda ishtirok etish uchun loyiha takliflarini tayyorlash; </w:t>
+        <w:br/>
+        <w:t>•davlat, nodavlat va notijorat tashkilotlar tomonidan e'lon qilingan loyihalarda ishtirok etish uchun loyiha takliflarini tayyorlash ko'nikmalariga ega bo'lish;</w:t>
       </w:r>
       <w:r>
         <w:rPr>
@@ -4420,7 +4415,6 @@
           <w:color w:val="000000"/>
           <w:sz w:val="28"/>
         </w:rPr>
-        <w:t xml:space="preserve">be able to creatively and critically review and analyze acquired </w:t>
       </w:r>
       <w:r>
         <w:rPr>
@@ -4430,7 +4424,6 @@
           <w:color w:val="000000"/>
           <w:sz w:val="28"/>
         </w:rPr>
-        <w:t xml:space="preserve">knowledge, use it in scientific and scientific-technical creative activity, and </w:t>
       </w:r>
       <w:r>
         <w:rPr>
@@ -4440,11 +4433,8 @@
           <w:color w:val="000000"/>
           <w:sz w:val="28"/>
         </w:rPr>
-        <w:t xml:space="preserve">make well-founded independent decisions; </w:t>
-      </w:r>
-      <w:r>
-        <w:br/>
-      </w:r>
+      </w:r>
+      <w:r/>
       <w:r>
         <w:rPr>
           <w:rFonts w:ascii="Symbol" w:hAnsi="Symbol" w:eastAsia="Symbol"/>
@@ -4453,7 +4443,6 @@
           <w:color w:val="000000"/>
           <w:sz w:val="20"/>
         </w:rPr>
-        <w:t></w:t>
       </w:r>
       <w:r>
         <w:rPr>
@@ -4463,7 +4452,6 @@
           <w:color w:val="000000"/>
           <w:sz w:val="28"/>
         </w:rPr>
-        <w:t xml:space="preserve">develop social responsibility aimed at understanding the outcomes of </w:t>
       </w:r>
       <w:r>
         <w:rPr>
@@ -4473,11 +4461,8 @@
           <w:color w:val="000000"/>
           <w:sz w:val="28"/>
         </w:rPr>
-        <w:t xml:space="preserve">scientific and scientific-technical creative activity; </w:t>
-      </w:r>
-      <w:r>
-        <w:br/>
-      </w:r>
+      </w:r>
+      <w:r/>
       <w:r>
         <w:rPr>
           <w:rFonts w:ascii="Symbol" w:hAnsi="Symbol" w:eastAsia="Symbol"/>
@@ -4486,7 +4471,6 @@
           <w:color w:val="000000"/>
           <w:sz w:val="20"/>
         </w:rPr>
-        <w:t></w:t>
       </w:r>
       <w:r>
         <w:rPr>
@@ -4496,7 +4480,6 @@
           <w:color w:val="000000"/>
           <w:sz w:val="28"/>
         </w:rPr>
-        <w:t xml:space="preserve">apply the basic laws of the disciplines mastered in professional activity, </w:t>
       </w:r>
       <w:r>
         <w:rPr>
@@ -4506,7 +4489,6 @@
           <w:color w:val="000000"/>
           <w:sz w:val="28"/>
         </w:rPr>
-        <w:t xml:space="preserve">classify methods, and use methodological principles in scientific and </w:t>
       </w:r>
       <w:r>
         <w:rPr>
@@ -4516,11 +4498,8 @@
           <w:color w:val="000000"/>
           <w:sz w:val="28"/>
         </w:rPr>
-        <w:t xml:space="preserve">scientific-technical creative activity; </w:t>
-      </w:r>
-      <w:r>
-        <w:br/>
-      </w:r>
+      </w:r>
+      <w:r/>
       <w:r>
         <w:rPr>
           <w:rFonts w:ascii="Symbol" w:hAnsi="Symbol" w:eastAsia="Symbol"/>
@@ -4529,7 +4508,6 @@
           <w:color w:val="000000"/>
           <w:sz w:val="20"/>
         </w:rPr>
-        <w:t></w:t>
       </w:r>
       <w:r>
         <w:rPr>
@@ -4539,7 +4517,6 @@
           <w:color w:val="000000"/>
           <w:sz w:val="28"/>
         </w:rPr>
-        <w:t xml:space="preserve">master one foreign language as a means of scientific communication and </w:t>
       </w:r>
       <w:r>
         <w:rPr>
@@ -4549,11 +4526,8 @@
           <w:color w:val="000000"/>
           <w:sz w:val="28"/>
         </w:rPr>
-        <w:t xml:space="preserve">professional exchange; </w:t>
-      </w:r>
-      <w:r>
-        <w:br/>
-      </w:r>
+      </w:r>
+      <w:r/>
       <w:r>
         <w:rPr>
           <w:rFonts w:ascii="Symbol" w:hAnsi="Symbol" w:eastAsia="Symbol"/>
@@ -4562,7 +4536,6 @@
           <w:color w:val="000000"/>
           <w:sz w:val="20"/>
         </w:rPr>
-        <w:t></w:t>
       </w:r>
       <w:r>
         <w:rPr>
@@ -4572,7 +4545,6 @@
           <w:color w:val="000000"/>
           <w:sz w:val="28"/>
         </w:rPr>
-        <w:t xml:space="preserve">axborotni to'plash, saqlash, qayta ishlash va foydalanish usullarini egallash; </w:t>
       </w:r>
       <w:r>
         <w:rPr>
@@ -4582,7 +4554,6 @@
           <w:color w:val="000000"/>
           <w:sz w:val="20"/>
         </w:rPr>
-        <w:t></w:t>
       </w:r>
       <w:r>
         <w:rPr>
@@ -4592,7 +4563,6 @@
           <w:color w:val="000000"/>
           <w:sz w:val="28"/>
         </w:rPr>
-        <w:t xml:space="preserve">be able to make well-founded independent decisions in professional </w:t>
       </w:r>
       <w:r>
         <w:rPr>
@@ -4602,11 +4572,8 @@
           <w:color w:val="000000"/>
           <w:sz w:val="28"/>
         </w:rPr>
-        <w:t xml:space="preserve">activity; </w:t>
-      </w:r>
-      <w:r>
-        <w:br/>
-      </w:r>
+      </w:r>
+      <w:r/>
       <w:r>
         <w:rPr>
           <w:rFonts w:ascii="Symbol" w:hAnsi="Symbol" w:eastAsia="Symbol"/>
@@ -4615,7 +4582,6 @@
           <w:color w:val="000000"/>
           <w:sz w:val="20"/>
         </w:rPr>
-        <w:t></w:t>
       </w:r>
       <w:r>
         <w:rPr>
@@ -4625,7 +4591,6 @@
           <w:color w:val="000000"/>
           <w:sz w:val="28"/>
         </w:rPr>
-        <w:t xml:space="preserve">be able to distinguish between information, knowledge, and data, and use </w:t>
       </w:r>
       <w:r>
         <w:rPr>
@@ -4635,11 +4600,8 @@
           <w:color w:val="000000"/>
           <w:sz w:val="28"/>
         </w:rPr>
-        <w:t xml:space="preserve">information technologies; </w:t>
-      </w:r>
-      <w:r>
-        <w:br/>
-      </w:r>
+      </w:r>
+      <w:r/>
       <w:r>
         <w:rPr>
           <w:rFonts w:ascii="Symbol" w:hAnsi="Symbol" w:eastAsia="Symbol"/>
@@ -4648,7 +4610,6 @@
           <w:color w:val="000000"/>
           <w:sz w:val="20"/>
         </w:rPr>
-        <w:t></w:t>
       </w:r>
       <w:r>
         <w:rPr>
@@ -4658,7 +4619,6 @@
           <w:color w:val="000000"/>
           <w:sz w:val="28"/>
         </w:rPr>
-        <w:t xml:space="preserve">understand the essence and importance of information technologies in </w:t>
       </w:r>
       <w:r>
         <w:rPr>
@@ -4668,7 +4628,6 @@
           <w:color w:val="000000"/>
           <w:sz w:val="28"/>
         </w:rPr>
-        <w:t xml:space="preserve">today’s information society, recognize the risks and threats of information </w:t>
       </w:r>
       <w:r>
         <w:rPr>
@@ -4678,7 +4637,6 @@
           <w:color w:val="000000"/>
           <w:sz w:val="28"/>
         </w:rPr>
-        <w:t xml:space="preserve">attacks, and comply with the basic requirements of information security; </w:t>
       </w:r>
       <w:r>
         <w:rPr>
@@ -4688,7 +4646,6 @@
           <w:color w:val="000000"/>
           <w:sz w:val="20"/>
         </w:rPr>
-        <w:t></w:t>
       </w:r>
       <w:r>
         <w:rPr>
@@ -4698,7 +4655,6 @@
           <w:color w:val="000000"/>
           <w:sz w:val="28"/>
         </w:rPr>
-        <w:t xml:space="preserve">possess the main methods and tools for obtaining, storing, and </w:t>
       </w:r>
       <w:r>
         <w:rPr>
@@ -4708,7 +4664,6 @@
           <w:color w:val="000000"/>
           <w:sz w:val="28"/>
         </w:rPr>
-        <w:t xml:space="preserve">processing information from the Internet, and have computer skills as a </w:t>
       </w:r>
       <w:r>
         <w:rPr>
@@ -4718,11 +4673,8 @@
           <w:color w:val="000000"/>
           <w:sz w:val="28"/>
         </w:rPr>
-        <w:t xml:space="preserve">means of information management; </w:t>
-      </w:r>
-      <w:r>
-        <w:br/>
-      </w:r>
+      </w:r>
+      <w:r/>
       <w:r>
         <w:rPr>
           <w:rFonts w:ascii="Symbol" w:hAnsi="Symbol" w:eastAsia="Symbol"/>
@@ -4731,7 +4683,6 @@
           <w:color w:val="000000"/>
           <w:sz w:val="20"/>
         </w:rPr>
-        <w:t></w:t>
       </w:r>
       <w:r>
         <w:rPr>
@@ -4741,7 +4692,6 @@
           <w:color w:val="000000"/>
           <w:sz w:val="28"/>
         </w:rPr>
-        <w:t xml:space="preserve">effectively use information and pedagogical technologies in pedagogical </w:t>
       </w:r>
       <w:r>
         <w:rPr>
@@ -4751,11 +4701,8 @@
           <w:color w:val="000000"/>
           <w:sz w:val="28"/>
         </w:rPr>
-        <w:t xml:space="preserve">activity; </w:t>
-      </w:r>
-      <w:r>
-        <w:br/>
-      </w:r>
+      </w:r>
+      <w:r/>
       <w:r>
         <w:rPr>
           <w:rFonts w:ascii="Symbol" w:hAnsi="Symbol" w:eastAsia="Symbol"/>
@@ -4764,7 +4711,6 @@
           <w:color w:val="000000"/>
           <w:sz w:val="20"/>
         </w:rPr>
-        <w:t></w:t>
       </w:r>
       <w:r>
         <w:rPr>
@@ -4774,7 +4720,6 @@
           <w:color w:val="000000"/>
           <w:sz w:val="28"/>
         </w:rPr>
-        <w:t xml:space="preserve">apply an innovative approach to improving the quality and effectiveness </w:t>
       </w:r>
       <w:r>
         <w:rPr>
@@ -4784,11 +4729,8 @@
           <w:color w:val="000000"/>
           <w:sz w:val="28"/>
         </w:rPr>
-        <w:t xml:space="preserve">of education and scientific-technical creative activity; </w:t>
-      </w:r>
-      <w:r>
-        <w:br/>
-      </w:r>
+      </w:r>
+      <w:r/>
       <w:r>
         <w:rPr>
           <w:rFonts w:ascii="Symbol" w:hAnsi="Symbol" w:eastAsia="Symbol"/>
@@ -4797,7 +4739,6 @@
           <w:color w:val="000000"/>
           <w:sz w:val="20"/>
         </w:rPr>
-        <w:t></w:t>
       </w:r>
       <w:r>
         <w:rPr>
@@ -4807,7 +4748,6 @@
           <w:color w:val="000000"/>
           <w:sz w:val="28"/>
         </w:rPr>
-        <w:t xml:space="preserve">prepare project proposals for participation in projects announced in the </w:t>
       </w:r>
       <w:r>
         <w:rPr>
@@ -4817,7 +4757,6 @@
           <w:color w:val="000000"/>
           <w:sz w:val="28"/>
         </w:rPr>
-        <w:t xml:space="preserve">Republic and abroad based on the results of scientific-technical creative </w:t>
       </w:r>
       <w:r>
         <w:rPr>
@@ -4827,11 +4766,8 @@
           <w:color w:val="000000"/>
           <w:sz w:val="28"/>
         </w:rPr>
-        <w:t xml:space="preserve">activity; </w:t>
-      </w:r>
-      <w:r>
-        <w:br/>
-      </w:r>
+      </w:r>
+      <w:r/>
       <w:r>
         <w:rPr>
           <w:rFonts w:ascii="Symbol" w:hAnsi="Symbol" w:eastAsia="Symbol"/>
@@ -4840,7 +4776,6 @@
           <w:color w:val="000000"/>
           <w:sz w:val="20"/>
         </w:rPr>
-        <w:t></w:t>
       </w:r>
       <w:r>
         <w:rPr>
@@ -4850,7 +4785,6 @@
           <w:color w:val="000000"/>
           <w:sz w:val="28"/>
         </w:rPr>
-        <w:t xml:space="preserve">possess skills in preparing project proposals for participation in projects </w:t>
       </w:r>
       <w:r>
         <w:rPr>
@@ -4860,7 +4794,6 @@
           <w:color w:val="000000"/>
           <w:sz w:val="28"/>
         </w:rPr>
-        <w:t xml:space="preserve">announced by state, non-state, and non-profit organizations; </w:t>
       </w:r>
     </w:p>
     <w:p>
@@ -4949,7 +4882,21 @@
           <w:color w:val="000000"/>
           <w:sz w:val="20"/>
         </w:rPr>
-        <w:t></w:t>
+        <w:t xml:space="preserve">•ilmiy va amaliy tadqiqotlar o'tkazish, tajriba natijalarini qayta ishlash, ular asosida ilmiy asoslangan xulosalar chiqarish, ilmiy maqolalar tayyorlash va tahrirlash, ilmiy seminarlar, konferentsiyalar va simpoziumlarni tashkil etish va o'tkazish hamda ilmiy loyihalar ishlab chiqish; </w:t>
+        <w:br/>
+        <w:t xml:space="preserve">•davlat, nodavlat va notijorat tashkilotlar tomonidan e'lon qilingan loyihalarda ishtirok etish uchun loyiha takliflarini tayyorlash ko'nikmalariga ega bo'lish; </w:t>
+        <w:br/>
+        <w:t xml:space="preserve">•ishlab chiqarishni tashkil etish va boshqarish ko'nikmalariga ega bo'lish; </w:t>
+        <w:br/>
+        <w:t xml:space="preserve">•tashkilotlar, korxonalar va ularning alohida bo'linmalarining tashkiliy tuzilmasini optimallashtirish, xodimlarning kasbiy tayyorgarlik darajasini uzluksiz oshirishni tashkil etish va boshqarish, mehnat salohiyatidan samarali foydalanishni rejalashtirish va mehnatni rag'batlantirish tizimini joriy etish; </w:t>
+        <w:br/>
+        <w:t xml:space="preserve">•tarmoqlar va sektorlardagi korxonalarda ishlab chiqarish va mehnat resurslaridan samarali foydalanish uchun ma'lumotlar fanini qo'llash; </w:t>
+        <w:br/>
+        <w:t xml:space="preserve">•olib borilayotgan nazariy va amaliy ishlar mavzulariga oid matematik, axborot va imitatsion modellarni ishlab chiqish va joriy etish; </w:t>
+        <w:br/>
+        <w:t xml:space="preserve">•tarmoqlar va sektorlarda ma'lumotlar fanini qo'llashda ta'sir etuvchi omillarni aniqlash uchun tadqiqot va tahliliy ishlarni olib borish; </w:t>
+        <w:br/>
+        <w:t>•me'yoriy-huquqiy hujjatlarning iqtisodiy ekspertizasini o'tkazish.</w:t>
       </w:r>
       <w:r>
         <w:rPr>
@@ -4959,11 +4906,8 @@
           <w:color w:val="000000"/>
           <w:sz w:val="28"/>
         </w:rPr>
-        <w:t xml:space="preserve">conduct scientific and applied research, process experimental results, </w:t>
-      </w:r>
-      <w:r>
-        <w:tab/>
-      </w:r>
+      </w:r>
+      <w:r/>
       <w:r>
         <w:rPr>
           <w:rFonts w:ascii="Arial" w:hAnsi="Arial" w:eastAsia="Arial"/>
@@ -4972,11 +4916,8 @@
           <w:color w:val="000000"/>
           <w:sz w:val="28"/>
         </w:rPr>
-        <w:t xml:space="preserve">draw scientifically grounded conclusions based on them, prepare and edit </w:t>
-      </w:r>
-      <w:r>
-        <w:tab/>
-      </w:r>
+      </w:r>
+      <w:r/>
       <w:r>
         <w:rPr>
           <w:rFonts w:ascii="Arial" w:hAnsi="Arial" w:eastAsia="Arial"/>
@@ -4985,11 +4926,8 @@
           <w:color w:val="000000"/>
           <w:sz w:val="28"/>
         </w:rPr>
-        <w:t xml:space="preserve">scientific articles, organize and conduct scientific seminars, conferences, </w:t>
-      </w:r>
-      <w:r>
-        <w:tab/>
-      </w:r>
+      </w:r>
+      <w:r/>
       <w:r>
         <w:rPr>
           <w:rFonts w:ascii="Arial" w:hAnsi="Arial" w:eastAsia="Arial"/>
@@ -4998,11 +4936,8 @@
           <w:color w:val="000000"/>
           <w:sz w:val="28"/>
         </w:rPr>
-        <w:t xml:space="preserve">and symposia, and develop scientific projects; </w:t>
-      </w:r>
-      <w:r>
-        <w:br/>
-      </w:r>
+      </w:r>
+      <w:r/>
       <w:r>
         <w:rPr>
           <w:rFonts w:ascii="Symbol" w:hAnsi="Symbol" w:eastAsia="Symbol"/>
@@ -5011,7 +4946,6 @@
           <w:color w:val="000000"/>
           <w:sz w:val="20"/>
         </w:rPr>
-        <w:t></w:t>
       </w:r>
       <w:r>
         <w:rPr>
@@ -5021,11 +4955,8 @@
           <w:color w:val="000000"/>
           <w:sz w:val="28"/>
         </w:rPr>
-        <w:t xml:space="preserve">possess skills in preparing project proposals for participation in projects </w:t>
-      </w:r>
-      <w:r>
-        <w:tab/>
-      </w:r>
+      </w:r>
+      <w:r/>
       <w:r>
         <w:rPr>
           <w:rFonts w:ascii="Arial" w:hAnsi="Arial" w:eastAsia="Arial"/>
@@ -5034,11 +4965,8 @@
           <w:color w:val="000000"/>
           <w:sz w:val="28"/>
         </w:rPr>
-        <w:t xml:space="preserve">announced by state, non-state, and non-profit organizations; </w:t>
-      </w:r>
-      <w:r>
-        <w:br/>
-      </w:r>
+      </w:r>
+      <w:r/>
       <w:r>
         <w:rPr>
           <w:rFonts w:ascii="Symbol" w:hAnsi="Symbol" w:eastAsia="Symbol"/>
@@ -5047,7 +4975,6 @@
           <w:color w:val="000000"/>
           <w:sz w:val="20"/>
         </w:rPr>
-        <w:t></w:t>
       </w:r>
       <w:r>
         <w:rPr>
@@ -5057,11 +4984,8 @@
           <w:color w:val="000000"/>
           <w:sz w:val="28"/>
         </w:rPr>
-        <w:t xml:space="preserve">ishlab chiqarishni tashkil etish va boshqarish ko'nikmalariga ega bo'lish; </w:t>
-      </w:r>
-      <w:r>
-        <w:br/>
-      </w:r>
+      </w:r>
+      <w:r/>
       <w:r>
         <w:rPr>
           <w:rFonts w:ascii="Symbol" w:hAnsi="Symbol" w:eastAsia="Symbol"/>
@@ -5070,7 +4994,6 @@
           <w:color w:val="000000"/>
           <w:sz w:val="20"/>
         </w:rPr>
-        <w:t></w:t>
       </w:r>
       <w:r>
         <w:rPr>
@@ -5080,11 +5003,8 @@
           <w:color w:val="000000"/>
           <w:sz w:val="28"/>
         </w:rPr>
-        <w:t xml:space="preserve">optimize the organizational structure of organizations, enterprises, and </w:t>
-      </w:r>
-      <w:r>
-        <w:tab/>
-      </w:r>
+      </w:r>
+      <w:r/>
       <w:r>
         <w:rPr>
           <w:rFonts w:ascii="Arial" w:hAnsi="Arial" w:eastAsia="Arial"/>
@@ -5093,11 +5013,8 @@
           <w:color w:val="000000"/>
           <w:sz w:val="28"/>
         </w:rPr>
-        <w:t xml:space="preserve">their individual divisions, organize and manage the continuous </w:t>
-      </w:r>
-      <w:r>
-        <w:tab/>
-      </w:r>
+      </w:r>
+      <w:r/>
       <w:r>
         <w:rPr>
           <w:rFonts w:ascii="Arial" w:hAnsi="Arial" w:eastAsia="Arial"/>
@@ -5106,11 +5023,8 @@
           <w:color w:val="000000"/>
           <w:sz w:val="28"/>
         </w:rPr>
-        <w:t xml:space="preserve">improvement of employees’ professional training levels, plan the effective </w:t>
-      </w:r>
-      <w:r>
-        <w:tab/>
-      </w:r>
+      </w:r>
+      <w:r/>
       <w:r>
         <w:rPr>
           <w:rFonts w:ascii="Arial" w:hAnsi="Arial" w:eastAsia="Arial"/>
@@ -5119,11 +5033,8 @@
           <w:color w:val="000000"/>
           <w:sz w:val="28"/>
         </w:rPr>
-        <w:t xml:space="preserve">use of labor potential, and establish a labor incentive system; </w:t>
-      </w:r>
-      <w:r>
-        <w:br/>
-      </w:r>
+      </w:r>
+      <w:r/>
       <w:r>
         <w:rPr>
           <w:rFonts w:ascii="Symbol" w:hAnsi="Symbol" w:eastAsia="Symbol"/>
@@ -5132,7 +5043,6 @@
           <w:color w:val="000000"/>
           <w:sz w:val="20"/>
         </w:rPr>
-        <w:t></w:t>
       </w:r>
       <w:r>
         <w:rPr>
@@ -5142,11 +5052,8 @@
           <w:color w:val="000000"/>
           <w:sz w:val="28"/>
         </w:rPr>
-        <w:t xml:space="preserve">apply data science for the effective use of production and labor resources </w:t>
-      </w:r>
-      <w:r>
-        <w:tab/>
-      </w:r>
+      </w:r>
+      <w:r/>
       <w:r>
         <w:rPr>
           <w:rFonts w:ascii="Arial" w:hAnsi="Arial" w:eastAsia="Arial"/>
@@ -5155,11 +5062,8 @@
           <w:color w:val="000000"/>
           <w:sz w:val="28"/>
         </w:rPr>
-        <w:t xml:space="preserve">in enterprises across networks and sectors; </w:t>
-      </w:r>
-      <w:r>
-        <w:br/>
-      </w:r>
+      </w:r>
+      <w:r/>
       <w:r>
         <w:rPr>
           <w:rFonts w:ascii="Symbol" w:hAnsi="Symbol" w:eastAsia="Symbol"/>
@@ -5168,7 +5072,6 @@
           <w:color w:val="000000"/>
           <w:sz w:val="20"/>
         </w:rPr>
-        <w:t></w:t>
       </w:r>
       <w:r>
         <w:rPr>
@@ -5178,11 +5081,8 @@
           <w:color w:val="000000"/>
           <w:sz w:val="28"/>
         </w:rPr>
-        <w:t xml:space="preserve">develop and implement mathematical, information, and simulation models </w:t>
-      </w:r>
-      <w:r>
-        <w:tab/>
-      </w:r>
+      </w:r>
+      <w:r/>
       <w:r>
         <w:rPr>
           <w:rFonts w:ascii="Arial" w:hAnsi="Arial" w:eastAsia="Arial"/>
@@ -5191,7 +5091,6 @@
           <w:color w:val="000000"/>
           <w:sz w:val="28"/>
         </w:rPr>
-        <w:t xml:space="preserve">related to the topics of theoretical and practical work being carried out; </w:t>
       </w:r>
       <w:r>
         <w:rPr>
@@ -5201,7 +5100,6 @@
           <w:color w:val="000000"/>
           <w:sz w:val="20"/>
         </w:rPr>
-        <w:t></w:t>
       </w:r>
       <w:r>
         <w:rPr>
@@ -5211,11 +5109,8 @@
           <w:color w:val="000000"/>
           <w:sz w:val="28"/>
         </w:rPr>
-        <w:t xml:space="preserve">conduct research and analytical work to identify influencing factors when </w:t>
-      </w:r>
-      <w:r>
-        <w:tab/>
-      </w:r>
+      </w:r>
+      <w:r/>
       <w:r>
         <w:rPr>
           <w:rFonts w:ascii="Arial" w:hAnsi="Arial" w:eastAsia="Arial"/>
@@ -5224,11 +5119,8 @@
           <w:color w:val="000000"/>
           <w:sz w:val="28"/>
         </w:rPr>
-        <w:t xml:space="preserve">using data science across networks and sectors; </w:t>
-      </w:r>
-      <w:r>
-        <w:br/>
-      </w:r>
+      </w:r>
+      <w:r/>
       <w:r>
         <w:rPr>
           <w:rFonts w:ascii="Symbol" w:hAnsi="Symbol" w:eastAsia="Symbol"/>
@@ -5237,7 +5129,6 @@
           <w:color w:val="000000"/>
           <w:sz w:val="20"/>
         </w:rPr>
-        <w:t></w:t>
       </w:r>
       <w:r>
         <w:rPr>
@@ -5247,7 +5138,6 @@
           <w:color w:val="000000"/>
           <w:sz w:val="28"/>
         </w:rPr>
-        <w:t xml:space="preserve">me'yoriy-huquqiy hujjatlarning iqtisodiy ekspertizasini o'tkazish. </w:t>
       </w:r>
     </w:p>
     <w:p>
@@ -5264,11 +5154,11 @@
         <w:jc w:val="left"/>
       </w:pPr>
       <w:r>
-        <w:tab/>
-      </w:r>
-      <w:r>
-        <w:tab/>
-      </w:r>
+        <w:t xml:space="preserve">3. ILMIY FAOLIYATGA QO'YILADIGAN TALABLAR </w:t>
+        <w:br/>
+        <w:t>Ilmiy faoliyat ixtisoslashtirilgan ilmiy va ta'lim muassasalarida talabalar tomonidan ilmiy tadqiqot metodologiyasini egallash hamda tadqiqot va ilmiy-pedagogik ishlarni bajarishni ta'minlashi kerak.</w:t>
+      </w:r>
+      <w:r/>
       <w:r>
         <w:rPr>
           <w:rFonts w:ascii="Arial" w:hAnsi="Arial" w:eastAsia="Arial"/>
@@ -5277,11 +5167,8 @@
           <w:color w:val="2E74B5"/>
           <w:sz w:val="28"/>
         </w:rPr>
-        <w:t xml:space="preserve">3. ILMIY FAOLIYATGA QO'YILADIGAN TALABLAR </w:t>
-      </w:r>
-      <w:r>
-        <w:br/>
-      </w:r>
+      </w:r>
+      <w:r/>
       <w:r>
         <w:rPr>
           <w:rFonts w:ascii="Arial" w:hAnsi="Arial" w:eastAsia="Arial"/>
@@ -5290,7 +5177,6 @@
           <w:color w:val="000000"/>
           <w:sz w:val="28"/>
         </w:rPr>
-        <w:t xml:space="preserve">Scientific activity shall provide for the mastery of scientific research </w:t>
       </w:r>
       <w:r>
         <w:rPr>
@@ -5300,7 +5186,6 @@
           <w:color w:val="000000"/>
           <w:sz w:val="28"/>
         </w:rPr>
-        <w:t xml:space="preserve">methodology and the performance of research and scientific-pedagogical work </w:t>
       </w:r>
       <w:r>
         <w:rPr>
@@ -5310,7 +5195,6 @@
           <w:color w:val="000000"/>
           <w:sz w:val="28"/>
         </w:rPr>
-        <w:t xml:space="preserve">by students at specialized scientific and educational institutions. </w:t>
       </w:r>
     </w:p>
     <w:p>
@@ -5330,7 +5214,7 @@
           <w:color w:val="000000"/>
           <w:sz w:val="28"/>
         </w:rPr>
-        <w:t xml:space="preserve">Requirements for research work and preparation of the master’s </w:t>
+        <w:t>Ilmiy-tadqiqot ishlariga va magistrlik dissertatsiyasini tayyorlashga qo'yiladigan talablar:</w:t>
       </w:r>
       <w:r>
         <w:rPr>
@@ -5340,7 +5224,6 @@
           <w:color w:val="000000"/>
           <w:sz w:val="28"/>
         </w:rPr>
-        <w:t xml:space="preserve">dissertation: </w:t>
       </w:r>
     </w:p>
     <w:p>
@@ -5400,10 +5283,10 @@
           <w:sz w:val="20"/>
         </w:rPr>
         <w:t>-</w:t>
-      </w:r>
-      <w:r>
         <w:tab/>
-      </w:r>
+        <w:t>zamonaviy texnologik vositalar yordamida ilmiy tadqiqotlar o'tkazish, tadqiqot natijalarini tahlil qilish va taqdim etish hamda ilmiy maqolalar tayyorlashga oid bilim va ko'nikmalarni shakllantirish;</w:t>
+      </w:r>
+      <w:r/>
       <w:r>
         <w:rPr>
           <w:rFonts w:ascii="Arial" w:hAnsi="Arial" w:eastAsia="Arial"/>
@@ -5412,11 +5295,8 @@
           <w:color w:val="000000"/>
           <w:sz w:val="28"/>
         </w:rPr>
-        <w:t xml:space="preserve">form knowledge and skills related to conducting scientific research using </w:t>
-      </w:r>
-      <w:r>
-        <w:tab/>
-      </w:r>
+      </w:r>
+      <w:r/>
       <w:r>
         <w:rPr>
           <w:rFonts w:ascii="Arial" w:hAnsi="Arial" w:eastAsia="Arial"/>
@@ -5425,11 +5305,8 @@
           <w:color w:val="000000"/>
           <w:sz w:val="28"/>
         </w:rPr>
-        <w:t xml:space="preserve">modern technological tools, analyzing and presenting research results, </w:t>
-      </w:r>
-      <w:r>
-        <w:tab/>
-      </w:r>
+      </w:r>
+      <w:r/>
       <w:r>
         <w:rPr>
           <w:rFonts w:ascii="Arial" w:hAnsi="Arial" w:eastAsia="Arial"/>
@@ -5438,7 +5315,6 @@
           <w:color w:val="000000"/>
           <w:sz w:val="28"/>
         </w:rPr>
-        <w:t xml:space="preserve">and preparing scientific articles; </w:t>
       </w:r>
     </w:p>
     <w:p>
@@ -5602,7 +5478,7 @@
           <w:color w:val="000000"/>
           <w:sz w:val="28"/>
         </w:rPr>
-        <w:t xml:space="preserve">achievements of science, engineering, and technology in the field and to </w:t>
+        <w:t>sohadagi fan, muhandislik va texnologiya yutuqlarini o'rganish va ularni magistrlik dissertatsiyasini tayyorlashda qo'llash.</w:t>
       </w:r>
       <w:r>
         <w:rPr>
@@ -5612,7 +5488,6 @@
           <w:color w:val="000000"/>
           <w:sz w:val="28"/>
         </w:rPr>
-        <w:t xml:space="preserve">apply them in preparing the master’s dissertation. </w:t>
       </w:r>
     </w:p>
     <w:p>
@@ -5748,16 +5623,14 @@
           <w:sz w:val="28"/>
         </w:rPr>
         <w:t xml:space="preserve">Ilmiy amaliyot (amaliy tajriba): </w:t>
-      </w:r>
-      <w:r>
         <w:br/>
-      </w:r>
-      <w:r>
         <w:tab/>
-      </w:r>
-      <w:r>
         <w:tab/>
-      </w:r>
+        <w:t>Magistratura talabalarini tayyorlashda ilmiy amaliyot 4-semestrda o'tkaziladi. U sohadagi ilmiy-tadqiqot ishlarini olib borish, nazariy va amaliy bilimlarni chuqurlashtirish, fan, soha va boshqa tarmoqlardagi zamonaviy uskunalar va texnologiyalar bilan tanishish, tegishli amaliy, kasbiy va tadqiqot kompetensiyalarini rivojlantirish hamda samarali kasbiy moslashuvni ta'minlash imkoniyatlarini berishi kerak.</w:t>
+      </w:r>
+      <w:r/>
+      <w:r/>
+      <w:r/>
       <w:r>
         <w:rPr>
           <w:rFonts w:ascii="Arial" w:hAnsi="Arial" w:eastAsia="Arial"/>
@@ -5766,7 +5639,6 @@
           <w:color w:val="000000"/>
           <w:sz w:val="28"/>
         </w:rPr>
-        <w:t xml:space="preserve">In the training of master’s degree students, the scientific internship </w:t>
       </w:r>
       <w:r>
         <w:rPr>
@@ -5776,7 +5648,6 @@
           <w:color w:val="000000"/>
           <w:sz w:val="28"/>
         </w:rPr>
-        <w:t xml:space="preserve">is conducted in the 4th semester. It shall provide opportunities to carry out </w:t>
       </w:r>
       <w:r>
         <w:rPr>
@@ -5786,7 +5657,6 @@
           <w:color w:val="000000"/>
           <w:sz w:val="28"/>
         </w:rPr>
-        <w:t xml:space="preserve">research work in the field, deepen theoretical and practical knowledge, </w:t>
       </w:r>
       <w:r>
         <w:rPr>
@@ -5796,7 +5666,6 @@
           <w:color w:val="000000"/>
           <w:sz w:val="28"/>
         </w:rPr>
-        <w:t xml:space="preserve">become familiar with modern equipment and technologies in science, the </w:t>
       </w:r>
       <w:r>
         <w:rPr>
@@ -5806,7 +5675,6 @@
           <w:color w:val="000000"/>
           <w:sz w:val="28"/>
         </w:rPr>
-        <w:t xml:space="preserve">field, and other sectors, develop relevant practical, professional, and </w:t>
       </w:r>
       <w:r>
         <w:rPr>
@@ -5816,7 +5684,6 @@
           <w:color w:val="000000"/>
           <w:sz w:val="28"/>
         </w:rPr>
-        <w:t xml:space="preserve">research competencies, and ensure effective professional adaptation. </w:t>
       </w:r>
     </w:p>
     <w:p>
@@ -8628,7 +8495,13 @@
                 <w:color w:val="000000"/>
                 <w:sz w:val="24"/>
               </w:rPr>
-              <w:t xml:space="preserve">Computational </w:t>
+              <w:t xml:space="preserve">Hisoblash usullari va </w:t>
+              <w:br/>
+              <w:t xml:space="preserve">modellashtirish. </w:t>
+              <w:br/>
+              <w:t xml:space="preserve">Veb-ilovalarni ishlab chiqish </w:t>
+              <w:br/>
+              <w:t>texnologiyalari.</w:t>
             </w:r>
             <w:r>
               <w:rPr>
@@ -8638,11 +8511,8 @@
                 <w:color w:val="000000"/>
                 <w:sz w:val="24"/>
               </w:rPr>
-              <w:t xml:space="preserve">Methods and </w:t>
             </w:r>
-            <w:r>
-              <w:br/>
-            </w:r>
+            <w:r/>
             <w:r>
               <w:rPr>
                 <w:rFonts w:ascii="Arial" w:hAnsi="Arial" w:eastAsia="Arial"/>
@@ -8651,7 +8521,6 @@
                 <w:color w:val="000000"/>
                 <w:sz w:val="24"/>
               </w:rPr>
-              <w:t xml:space="preserve">Modelling. </w:t>
             </w:r>
           </w:p>
           <w:p>
@@ -8671,7 +8540,13 @@
                 <w:color w:val="000000"/>
                 <w:sz w:val="24"/>
               </w:rPr>
-              <w:t xml:space="preserve">Web Application </w:t>
+              <w:t xml:space="preserve">Hisoblash usullari va </w:t>
+              <w:br/>
+              <w:t xml:space="preserve">modellashtirish. </w:t>
+              <w:br/>
+              <w:t xml:space="preserve">Veb-ilovalarni ishlab chiqish </w:t>
+              <w:br/>
+              <w:t>texnologiyalari.</w:t>
             </w:r>
             <w:r>
               <w:rPr>
@@ -8681,11 +8556,8 @@
                 <w:color w:val="000000"/>
                 <w:sz w:val="24"/>
               </w:rPr>
-              <w:t xml:space="preserve">Development </w:t>
             </w:r>
-            <w:r>
-              <w:br/>
-            </w:r>
+            <w:r/>
             <w:r>
               <w:rPr>
                 <w:rFonts w:ascii="Arial" w:hAnsi="Arial" w:eastAsia="Arial"/>
@@ -8694,7 +8566,6 @@
                 <w:color w:val="000000"/>
                 <w:sz w:val="24"/>
               </w:rPr>
-              <w:t xml:space="preserve">Technologies. </w:t>
             </w:r>
           </w:p>
         </w:tc>
@@ -9656,11 +9527,13 @@
                 <w:color w:val="000000"/>
                 <w:sz w:val="24"/>
               </w:rPr>
-              <w:t xml:space="preserve">Electronic </w:t>
+              <w:t xml:space="preserve">Elektron </w:t>
+              <w:br/>
+              <w:t xml:space="preserve">hukumat. </w:t>
+              <w:br/>
+              <w:t>Django framework asoslari.</w:t>
             </w:r>
-            <w:r>
-              <w:br/>
-            </w:r>
+            <w:r/>
             <w:r>
               <w:rPr>
                 <w:rFonts w:ascii="Arial" w:hAnsi="Arial" w:eastAsia="Arial"/>
@@ -9669,7 +9542,6 @@
                 <w:color w:val="000000"/>
                 <w:sz w:val="24"/>
               </w:rPr>
-              <w:t xml:space="preserve">Government. </w:t>
             </w:r>
           </w:p>
           <w:p>
@@ -9689,7 +9561,11 @@
                 <w:color w:val="000000"/>
                 <w:sz w:val="24"/>
               </w:rPr>
-              <w:t xml:space="preserve">Fundamentals of the </w:t>
+              <w:t xml:space="preserve">Elektron </w:t>
+              <w:br/>
+              <w:t xml:space="preserve">hukumat. </w:t>
+              <w:br/>
+              <w:t>Django framework asoslari.</w:t>
             </w:r>
             <w:r>
               <w:rPr>
@@ -9699,7 +9575,6 @@
                 <w:color w:val="000000"/>
                 <w:sz w:val="24"/>
               </w:rPr>
-              <w:t xml:space="preserve">Django Framework. </w:t>
             </w:r>
           </w:p>
         </w:tc>
@@ -11014,7 +10889,7 @@
           <w:color w:val="000000"/>
           <w:sz w:val="28"/>
         </w:rPr>
-        <w:t xml:space="preserve">Type of professional activity, specialty, object of professional activity, area of </w:t>
+        <w:t>Kasbiy faoliyat turi, mutaxassislik, kasbiy faoliyat ob'ekti, kasbiy faoliyat sohasi, magistraturaning asosiy o'quv rejasi va o'quv dasturlari, profil, o'quv natijalari, tarmoqlar va sektorlar, malaka talablari, magistratura ta'lim jarayoni, iqtisodiyot, mustaqil ta'lim, ishlab chiqarish, ilmiy tadqiqot jarayoni, tashkiliy va boshqaruv faoliyati, xizmat ko'rsatish, malaka amaliyoti, davlat attestatsiyasi, o'quv kurs bloki, oliy ta'lim muassasasi, ta'lim jarayoni, boshqaruv jarayoni, vizual dizayn, algoritmlar, hisoblash texnikasi, dasturiy ta'minot, modellashtirish, matematik model, axborot va kommunikatsiya tizimlari, zamonaviy tadqiqot usullari, axborot va zamonaviy pedagogik texnologiyalar, ilmiy tadqiqotni tashkil etish, virtual elektron bilim resurslari, didaktika, nazariya.</w:t>
       </w:r>
       <w:r>
         <w:rPr>
@@ -11024,7 +10899,6 @@
           <w:color w:val="000000"/>
           <w:sz w:val="28"/>
         </w:rPr>
-        <w:t xml:space="preserve">professional activity, core master’s curriculum and academic programs, profile, </w:t>
       </w:r>
       <w:r>
         <w:rPr>
@@ -11034,7 +10908,6 @@
           <w:color w:val="000000"/>
           <w:sz w:val="28"/>
         </w:rPr>
-        <w:t xml:space="preserve">learning outcomes, networks and sectors, qualification requirements, master’s </w:t>
       </w:r>
       <w:r>
         <w:rPr>
@@ -11044,7 +10917,6 @@
           <w:color w:val="000000"/>
           <w:sz w:val="28"/>
         </w:rPr>
-        <w:t xml:space="preserve">educational process, economy, independent learning, production, scientific </w:t>
       </w:r>
       <w:r>
         <w:rPr>
@@ -11054,7 +10926,6 @@
           <w:color w:val="000000"/>
           <w:sz w:val="28"/>
         </w:rPr>
-        <w:t xml:space="preserve">research process, organizational and managerial activity, service provision, </w:t>
       </w:r>
       <w:r>
         <w:rPr>
@@ -11064,7 +10935,6 @@
           <w:color w:val="000000"/>
           <w:sz w:val="28"/>
         </w:rPr>
-        <w:t xml:space="preserve">qualification internship, state attestation, academic course block, higher </w:t>
       </w:r>
       <w:r>
         <w:rPr>
@@ -11074,7 +10944,6 @@
           <w:color w:val="000000"/>
           <w:sz w:val="28"/>
         </w:rPr>
-        <w:t xml:space="preserve">education institution, educational process, management process, visual design, </w:t>
       </w:r>
       <w:r>
         <w:rPr>
@@ -11084,7 +10953,6 @@
           <w:color w:val="000000"/>
           <w:sz w:val="28"/>
         </w:rPr>
-        <w:t xml:space="preserve">algorithms, computing equipment, software, modeling, mathematical model, </w:t>
       </w:r>
       <w:r>
         <w:rPr>
@@ -11094,7 +10962,6 @@
           <w:color w:val="000000"/>
           <w:sz w:val="28"/>
         </w:rPr>
-        <w:t xml:space="preserve">information and communication systems, modern research methods, </w:t>
       </w:r>
       <w:r>
         <w:rPr>
@@ -11104,7 +10971,6 @@
           <w:color w:val="000000"/>
           <w:sz w:val="28"/>
         </w:rPr>
-        <w:t xml:space="preserve">information and modern pedagogical technologies, organization of scientific </w:t>
       </w:r>
       <w:r>
         <w:rPr>
@@ -11114,7 +10980,6 @@
           <w:color w:val="000000"/>
           <w:sz w:val="28"/>
         </w:rPr>
-        <w:t xml:space="preserve">research, virtual electronic knowledge resources, didactics, theory. </w:t>
       </w:r>
     </w:p>
     <w:p>
@@ -11618,7 +11483,6 @@
                 <w:color w:val="000000"/>
                 <w:sz w:val="24"/>
               </w:rPr>
-              <w:t xml:space="preserve">Seal          June 14, 2024 </w:t>
             </w:r>
           </w:p>
         </w:tc>
@@ -11687,7 +11551,7 @@
                 <w:color w:val="000000"/>
                 <w:sz w:val="24"/>
               </w:rPr>
-              <w:t xml:space="preserve">Rector ____________________ </w:t>
+              <w:t>Rektor ____________________ Akademik S. M. Turabdjanov</w:t>
             </w:r>
             <w:r>
               <w:rPr>
@@ -11697,7 +11561,6 @@
                 <w:color w:val="000000"/>
                 <w:sz w:val="24"/>
               </w:rPr>
-              <w:t xml:space="preserve">Academician S. M. Turabdjanov </w:t>
             </w:r>
           </w:p>
           <w:p>
@@ -11717,7 +11580,7 @@
                 <w:color w:val="000000"/>
                 <w:sz w:val="24"/>
               </w:rPr>
-              <w:t xml:space="preserve">Seal          June 13, 2024 </w:t>
+              <w:t>Muhr          2024-yil 13-iyun</w:t>
             </w:r>
           </w:p>
         </w:tc>
@@ -11790,7 +11653,7 @@
                 <w:color w:val="000000"/>
                 <w:sz w:val="24"/>
               </w:rPr>
-              <w:t xml:space="preserve">Director ____________________ A. </w:t>
+              <w:t>Direktor ____________________ A. Kadirov</w:t>
             </w:r>
             <w:r>
               <w:rPr>
@@ -11800,7 +11663,6 @@
                 <w:color w:val="000000"/>
                 <w:sz w:val="24"/>
               </w:rPr>
-              <w:t xml:space="preserve">Kadirov </w:t>
             </w:r>
           </w:p>
           <w:p>
@@ -11820,7 +11682,7 @@
                 <w:color w:val="000000"/>
                 <w:sz w:val="24"/>
               </w:rPr>
-              <w:t xml:space="preserve">Seal          June 13, 2024 </w:t>
+              <w:t>Muhr          2024-yil 13-iyun</w:t>
             </w:r>
           </w:p>
         </w:tc>

</xml_diff>

<commit_message>
Update Annex 22, 32 translations (agent refinements)
Co-Authored-By: Claude Opus 4.6 <noreply@anthropic.com>
Claude-Session: https://claude.ai/code/session_01N9ZP28hxEfPoWHf2qaE8QM
</commit_message>
<xml_diff>
--- a/Computer Engineering, Software Engineering, Computer systems & their softwares/Annexes/Annex №22 NQF COMPUTER SYSTEMS AND THEIR SOFTWARES.docx
+++ b/Computer Engineering, Software Engineering, Computer systems & their softwares/Annexes/Annex №22 NQF COMPUTER SYSTEMS AND THEIR SOFTWARES.docx
@@ -5455,7 +5455,7 @@
                 <w:color w:val="000000"/>
                 <w:sz w:val="28"/>
               </w:rPr>
-              <w:t xml:space="preserve">develop students’ ability to use information databases based on the latest </w:t>
+              <w:t xml:space="preserve">eng so'nggi yutuqlarga asoslangan axborot ma'lumotlar bazalaridan foydalanish qobiliyatini talabalarda rivojlantirish </w:t>
             </w:r>
           </w:p>
         </w:tc>
@@ -5717,7 +5717,7 @@
           <w:color w:val="000000"/>
           <w:sz w:val="28"/>
         </w:rPr>
-        <w:t xml:space="preserve">is expected to be completed according to an individual schedule of the </w:t>
+        <w:t xml:space="preserve">ta'lim jarayonining individual jadvali bo'yicha bajarishi </w:t>
       </w:r>
       <w:r>
         <w:rPr>
@@ -5727,7 +5727,7 @@
           <w:color w:val="000000"/>
           <w:sz w:val="28"/>
         </w:rPr>
-        <w:t xml:space="preserve">educational process </w:t>
+        <w:t xml:space="preserve">kutiladi </w:t>
       </w:r>
       <w:r>
         <w:br/>
@@ -5762,7 +5762,7 @@
           <w:color w:val="000000"/>
           <w:sz w:val="28"/>
         </w:rPr>
-        <w:t xml:space="preserve">The module catalogue is structured to ensure the systematic development </w:t>
+        <w:t xml:space="preserve">Modul katalogi kompyuter tizimlari va ularning dasturiy ta'minoti bo'yicha </w:t>
       </w:r>
       <w:r>
         <w:rPr>
@@ -5772,7 +5772,7 @@
           <w:color w:val="000000"/>
           <w:sz w:val="28"/>
         </w:rPr>
-        <w:t xml:space="preserve">of advanced theoretical knowledge, professional competencies, research skills, </w:t>
+        <w:t xml:space="preserve">ilg'or nazariy bilimlar, kasbiy kompetensiyalar, tadqiqot ko'nikmalari, </w:t>
       </w:r>
       <w:r>
         <w:rPr>
@@ -5782,7 +5782,7 @@
           <w:color w:val="000000"/>
           <w:sz w:val="28"/>
         </w:rPr>
-        <w:t xml:space="preserve">scientific and pedagogical abilities, and practical skills in computer systems and </w:t>
+        <w:t xml:space="preserve">ilmiy va pedagogik qobiliyatlar hamda amaliy ko'nikmalarning tizimli </w:t>
       </w:r>
       <w:r>
         <w:rPr>
@@ -5792,7 +5792,7 @@
           <w:color w:val="000000"/>
           <w:sz w:val="28"/>
         </w:rPr>
-        <w:t xml:space="preserve">their software. It consists of compulsory courses, elective courses, scientific and </w:t>
+        <w:t xml:space="preserve">rivojlanishini ta'minlash uchun tuzilgan. U majburiy kurslar, tanlov kurslari, ilmiy va </w:t>
       </w:r>
       <w:r>
         <w:rPr>
@@ -5802,7 +5802,7 @@
           <w:color w:val="000000"/>
           <w:sz w:val="28"/>
         </w:rPr>
-        <w:t xml:space="preserve">pedagogical work, qualification internship, and research work related to the </w:t>
+        <w:t xml:space="preserve">pedagogik ish, malaka amaliyoti hamda magistrlik dissertatsiyasini </w:t>
       </w:r>
       <w:r>
         <w:rPr>
@@ -10366,7 +10366,7 @@
                 <w:color w:val="000000"/>
                 <w:sz w:val="24"/>
               </w:rPr>
-              <w:t xml:space="preserve">Research Work, </w:t>
+              <w:t xml:space="preserve">Ilmiy-tadqiqot ishi, </w:t>
             </w:r>
             <w:r>
               <w:br/>
@@ -10379,7 +10379,7 @@
                 <w:color w:val="000000"/>
                 <w:sz w:val="24"/>
               </w:rPr>
-              <w:t xml:space="preserve">Preparation and </w:t>
+              <w:t xml:space="preserve">magistrlik dissertatsiyasini </w:t>
             </w:r>
             <w:r>
               <w:br/>
@@ -10392,7 +10392,7 @@
                 <w:color w:val="000000"/>
                 <w:sz w:val="24"/>
               </w:rPr>
-              <w:t xml:space="preserve">Defense of the </w:t>
+              <w:t xml:space="preserve">tayyorlash va </w:t>
             </w:r>
             <w:r>
               <w:br/>

</xml_diff>

<commit_message>
Translate Annex 13 State Standardised Classifier to Uzbek DOCX
- Annex 13: State Standardised Classifier of Educational Programs (36 pages) - new
- Annex 22: minor update

Co-Authored-By: Claude Opus 4.6 <noreply@anthropic.com>
Claude-Session: https://claude.ai/code/session_01N9ZP28hxEfPoWHf2qaE8QM
</commit_message>
<xml_diff>
--- a/Computer Engineering, Software Engineering, Computer systems & their softwares/Annexes/Annex №22 NQF COMPUTER SYSTEMS AND THEIR SOFTWARES.docx
+++ b/Computer Engineering, Software Engineering, Computer systems & their softwares/Annexes/Annex №22 NQF COMPUTER SYSTEMS AND THEIR SOFTWARES.docx
@@ -1260,7 +1260,7 @@
           <w:color w:val="000000"/>
           <w:sz w:val="28"/>
         </w:rPr>
-        <w:t xml:space="preserve">process on their basis, as well as ensuring, within their authority, the required </w:t>
+        <w:t xml:space="preserve">bitiruvchilarning tayyorgarlik darajasini ta'minlash uchun javobgar oliy </w:t>
       </w:r>
       <w:r>
         <w:rPr>
@@ -2267,7 +2267,7 @@
           <w:color w:val="000000"/>
           <w:sz w:val="28"/>
         </w:rPr>
-        <w:t>Software</w:t>
+        <w:t>ta'minoti</w:t>
       </w:r>
       <w:r>
         <w:rPr>
@@ -4098,7 +4098,7 @@
           <w:color w:val="000000"/>
           <w:sz w:val="28"/>
         </w:rPr>
-        <w:t xml:space="preserve">70610101 — Computer Systems and Their Software </w:t>
+        <w:t xml:space="preserve">70610101 — Kompyuter tizimlari va ularning dasturiy ta'minoti </w:t>
       </w:r>
       <w:r>
         <w:rPr>
@@ -4118,7 +4118,7 @@
           <w:color w:val="000000"/>
           <w:sz w:val="28"/>
         </w:rPr>
-        <w:t xml:space="preserve"> Program must possess the following professional </w:t>
+        <w:t xml:space="preserve"> bitiruvchilari quyidagi kasbiy </w:t>
       </w:r>
       <w:r>
         <w:rPr>
@@ -4128,7 +4128,7 @@
           <w:color w:val="000000"/>
           <w:sz w:val="28"/>
         </w:rPr>
-        <w:t xml:space="preserve">competencies: </w:t>
+        <w:t xml:space="preserve">kompetensiyalarga ega bo'lishlari kerak: </w:t>
       </w:r>
       <w:r>
         <w:br/>
@@ -4151,7 +4151,7 @@
           <w:color w:val="000000"/>
           <w:sz w:val="28"/>
         </w:rPr>
-        <w:t>possess a system of knowledge related to scientific and scientific-</w:t>
+        <w:t xml:space="preserve">ilmiy va ilmiy-texnik dunyoqarashga oid bilimlar tizimiga ega bo'lish, </w:t>
       </w:r>
       <w:r>
         <w:tab/>
@@ -4164,7 +4164,7 @@
           <w:color w:val="000000"/>
           <w:sz w:val="28"/>
         </w:rPr>
-        <w:t xml:space="preserve">technical worldviews, know the fundamentals of general methodological </w:t>
+        <w:t xml:space="preserve">umumiy metodologik fanlar asoslarini bilish va </w:t>
       </w:r>
       <w:r>
         <w:tab/>
@@ -4177,7 +4177,7 @@
           <w:color w:val="000000"/>
           <w:sz w:val="28"/>
         </w:rPr>
-        <w:t xml:space="preserve">disciplines, and understand current issues of state policy; </w:t>
+        <w:t xml:space="preserve">davlat siyosatining dolzarb masalalarini tushunish; </w:t>
       </w:r>
       <w:r>
         <w:br/>
@@ -4220,7 +4220,7 @@
           <w:color w:val="000000"/>
           <w:sz w:val="28"/>
         </w:rPr>
-        <w:t xml:space="preserve">be able to independently acquire and improve new knowledge and </w:t>
+        <w:t xml:space="preserve">yangi bilimlarni mustaqil egallash va takomillashtirish hamda </w:t>
       </w:r>
       <w:r>
         <w:tab/>
@@ -4233,7 +4233,7 @@
           <w:color w:val="000000"/>
           <w:sz w:val="28"/>
         </w:rPr>
-        <w:t xml:space="preserve">organize their work on a scientific basis; </w:t>
+        <w:t xml:space="preserve">o'z ishini ilmiy asosda tashkil etishga qodir bo'lish; </w:t>
       </w:r>
       <w:r>
         <w:br/>
@@ -4279,7 +4279,7 @@
           <w:color w:val="000000"/>
           <w:sz w:val="28"/>
         </w:rPr>
-        <w:t xml:space="preserve">possess a culture of thinking, a specific style of reasoning, and the ability </w:t>
+        <w:t xml:space="preserve">fikrlash madaniyatiga, muayyan fikr yuritish uslubiga va </w:t>
       </w:r>
       <w:r>
         <w:tab/>
@@ -4292,7 +4292,7 @@
           <w:color w:val="000000"/>
           <w:sz w:val="28"/>
         </w:rPr>
-        <w:t xml:space="preserve">to express oral and written speech clearly; </w:t>
+        <w:t xml:space="preserve">og'zaki va yozma nutqni aniq ifodalash qobiliyatiga ega bo'lish; </w:t>
       </w:r>
     </w:p>
     <w:p>

</xml_diff>

<commit_message>
Update Annex 22 NQF translation
Co-Authored-By: Claude Opus 4.6 <noreply@anthropic.com>
Claude-Session: https://claude.ai/code/session_01N9ZP28hxEfPoWHf2qaE8QM
</commit_message>
<xml_diff>
--- a/Computer Engineering, Software Engineering, Computer systems & their softwares/Annexes/Annex №22 NQF COMPUTER SYSTEMS AND THEIR SOFTWARES.docx
+++ b/Computer Engineering, Software Engineering, Computer systems & their softwares/Annexes/Annex №22 NQF COMPUTER SYSTEMS AND THEIR SOFTWARES.docx
@@ -1332,7 +1332,7 @@
           <w:color w:val="000000"/>
           <w:sz w:val="28"/>
         </w:rPr>
-        <w:t xml:space="preserve">preparedness of master’s degree graduates; </w:t>
+        <w:t xml:space="preserve">javobgar Davlat attestatsiya komissiyalari; </w:t>
       </w:r>
       <w:r>
         <w:br/>
@@ -1508,7 +1508,7 @@
           <w:color w:val="000000"/>
           <w:sz w:val="28"/>
         </w:rPr>
-        <w:t xml:space="preserve">Bachelor’s degree graduates applying for admission to higher education </w:t>
+        <w:t xml:space="preserve">Oliy ta’lim muassasalariga qabul qilish uchun murojaat qilayotgan </w:t>
       </w:r>
       <w:r>
         <w:rPr>
@@ -1708,7 +1708,7 @@
           <w:color w:val="000000"/>
           <w:sz w:val="28"/>
         </w:rPr>
-        <w:t xml:space="preserve">Graduates of the master’s specialty </w:t>
+        <w:t xml:space="preserve">Magistrlik mutaxassisligi </w:t>
       </w:r>
       <w:r>
         <w:rPr>
@@ -2247,7 +2247,7 @@
           <w:color w:val="000000"/>
           <w:sz w:val="28"/>
         </w:rPr>
-        <w:t xml:space="preserve">master’s graduates in the specialty </w:t>
+        <w:t xml:space="preserve">turlari </w:t>
       </w:r>
       <w:r>
         <w:rPr>
@@ -4108,7 +4108,7 @@
           <w:color w:val="000000"/>
           <w:sz w:val="28"/>
         </w:rPr>
-        <w:t>Master’s Degree</w:t>
+        <w:t>magistratura dasturi</w:t>
       </w:r>
       <w:r>
         <w:rPr>
@@ -5707,7 +5707,7 @@
           <w:color w:val="000000"/>
           <w:sz w:val="28"/>
         </w:rPr>
-        <w:t xml:space="preserve">The scientific internship of a master’s student assigned to such internship </w:t>
+        <w:t xml:space="preserve">Bunday amaliyotga tayinlangan magistrant talabaning ilmiy amaliyotini </w:t>
       </w:r>
       <w:r>
         <w:rPr>
@@ -5812,7 +5812,7 @@
           <w:color w:val="000000"/>
           <w:sz w:val="28"/>
         </w:rPr>
-        <w:t xml:space="preserve">preparation and defense of the Master’s dissertation. </w:t>
+        <w:t xml:space="preserve">tayyorlash va himoya qilish bilan bog’liq ilmiy-tadqiqot ishlaridan iborat. </w:t>
       </w:r>
     </w:p>
     <w:tbl>

</xml_diff>